<commit_message>
AIS mostly done and some of AI 2 lab done
</commit_message>
<xml_diff>
--- a/Проектный практикум/Концепция.docx
+++ b/Проектный практикум/Концепция.docx
@@ -4,17 +4,15 @@
   <w:body>
     <w:p>
       <w:pPr>
-        <w:pStyle w:val="1"/>
+        <w:pStyle w:val="Heading1"/>
+        <w:numPr>
+          <w:ilvl w:val="0"/>
+          <w:numId w:val="9"/>
+        </w:numPr>
         <w:rPr>
           <w:lang w:val="ru-RU"/>
         </w:rPr>
       </w:pPr>
-      <w:r>
-        <w:rPr>
-          <w:lang w:val="ru-RU"/>
-        </w:rPr>
-        <w:t xml:space="preserve">1 </w:t>
-      </w:r>
       <w:r>
         <w:rPr>
           <w:lang w:val="ru-RU"/>
@@ -24,34 +22,125 @@
     </w:p>
     <w:p>
       <w:pPr>
-        <w:pStyle w:val="ac"/>
+        <w:pStyle w:val="a"/>
+      </w:pPr>
+    </w:p>
+    <w:p>
+      <w:pPr>
+        <w:pStyle w:val="Heading2"/>
+        <w:numPr>
+          <w:ilvl w:val="1"/>
+          <w:numId w:val="9"/>
+        </w:numPr>
         <w:rPr>
           <w:lang w:val="ru-RU"/>
         </w:rPr>
       </w:pPr>
-    </w:p>
-    <w:p>
-      <w:pPr>
-        <w:pStyle w:val="2"/>
+      <w:r>
         <w:rPr>
           <w:lang w:val="ru-RU"/>
         </w:rPr>
-      </w:pPr>
-      <w:r>
+        <w:t>Описание</w:t>
+      </w:r>
+    </w:p>
+    <w:p>
+      <w:pPr>
+        <w:pStyle w:val="a0"/>
+      </w:pPr>
+      <w:r>
+        <w:t>Вы – Филипп, исследователь, отправленный на отдалённый остров. Жители вам не рады, но и вы приехали сюда не для того, чтобы дружить с островитянами, ваша задача – это исследование заброшенной шахты, которой заинтересовалась ваша компания. Прошлая группа вернула записи, белоснежное место, песок под ногами и деревья, которые ушли настолько высоко в небо, что кажется, словно они спускаются с него.</w:t>
+      </w:r>
+    </w:p>
+    <w:p>
+      <w:pPr>
+        <w:pStyle w:val="a0"/>
+      </w:pPr>
+    </w:p>
+    <w:p>
+      <w:pPr>
+        <w:pStyle w:val="a0"/>
+        <w:numPr>
+          <w:ilvl w:val="1"/>
+          <w:numId w:val="9"/>
+        </w:numPr>
+      </w:pPr>
+      <w:r>
+        <w:t>Ожидаемые решения</w:t>
+      </w:r>
+    </w:p>
+    <w:p>
+      <w:pPr>
+        <w:pStyle w:val="a0"/>
+      </w:pPr>
+      <w:r>
+        <w:t>Первый уровень будет тренировочным и проходить он будет в стартовой локации – в белоснежном лесу. На старте забега игрок получает пистолет, его обучат передвижению. Первый враг будет слабым</w:t>
+      </w:r>
+      <w:r>
+        <w:t>,</w:t>
+      </w:r>
+      <w:r>
+        <w:t xml:space="preserve"> его рост соответствует игроку, имеет большой хитбокс для критических попаданий, агрессивное поведение характеризуется движением в сторону пользователя и атакой если тот находится в пределах достижимости.  На нём игрока обучат стрельбе</w:t>
+      </w:r>
+      <w:r>
+        <w:t xml:space="preserve">. </w:t>
+      </w:r>
+      <w:r>
+        <w:t xml:space="preserve">После того как враг будет повержен из него выпадут ресурс и валюта, будут объяснены их </w:t>
+      </w:r>
+      <w:r>
+        <w:t>назначение</w:t>
+      </w:r>
+      <w:r>
+        <w:t xml:space="preserve"> с помощью подсказок. Создаётся новый враг, чтобы показать механику скрытности. Когда враг будет повержен, появится новая подсказка, что стелс награждается большим количеством ресурсов, но обременяется меньшим количеством валюты. По окончанию тестировочного уровня валюта обнуляется, это отмечается и подсказкой. На следующем заходе игрок предоставлен себе, противники с </w:t>
+      </w:r>
+      <w:r>
+        <w:t>тренировочн</w:t>
+      </w:r>
+      <w:r>
+        <w:t>ого уровня, улучшения на уровне генерируются игровой системой. После преодоления трёх уровней, игрок встретит босса</w:t>
+      </w:r>
+      <w:r>
+        <w:t>, это будет тренировкой по механикам и атакам нового противника, после победы над которым он станет доступным в лабиринтах.</w:t>
+      </w:r>
+      <w:r>
+        <w:t xml:space="preserve"> После победы в лабиринте игроку выдаётся 100% ресурса, собранного в лабиринте, в случае поражения лишь 33% будет возвращено, возвращаемый ресурс не обязательно будет наивысшей редкости. Так же будет дана возможность уйти из лабиринта перед боссом.</w:t>
+      </w:r>
+    </w:p>
+    <w:p>
+      <w:pPr>
+        <w:pStyle w:val="a"/>
         <w:rPr>
           <w:lang w:val="ru-RU"/>
         </w:rPr>
-        <w:t>1.1. Концепция приложения</w:t>
-      </w:r>
-    </w:p>
-    <w:p>
-      <w:pPr>
-        <w:pStyle w:val="ad"/>
-      </w:pPr>
-    </w:p>
-    <w:p>
-      <w:pPr>
-        <w:pStyle w:val="ad"/>
+      </w:pPr>
+    </w:p>
+    <w:p>
+      <w:pPr>
+        <w:pStyle w:val="Heading2"/>
+        <w:numPr>
+          <w:ilvl w:val="1"/>
+          <w:numId w:val="9"/>
+        </w:numPr>
+        <w:rPr>
+          <w:lang w:val="ru-RU"/>
+        </w:rPr>
+      </w:pPr>
+      <w:r>
+        <w:rPr>
+          <w:lang w:val="ru-RU"/>
+        </w:rPr>
+        <w:lastRenderedPageBreak/>
+        <w:t>Критерии завершенности проекта</w:t>
+      </w:r>
+    </w:p>
+    <w:p>
+      <w:pPr>
+        <w:pStyle w:val="a0"/>
+      </w:pPr>
+    </w:p>
+    <w:p>
+      <w:pPr>
+        <w:pStyle w:val="a0"/>
       </w:pPr>
       <w:r>
         <w:t xml:space="preserve">Шутер с элементами </w:t>
@@ -95,7 +184,7 @@
     </w:p>
     <w:p>
       <w:pPr>
-        <w:pStyle w:val="ad"/>
+        <w:pStyle w:val="a0"/>
       </w:pPr>
       <w:r>
         <w:t>1. Критерии для уровня</w:t>
@@ -103,7 +192,7 @@
     </w:p>
     <w:p>
       <w:pPr>
-        <w:pStyle w:val="ad"/>
+        <w:pStyle w:val="a0"/>
       </w:pPr>
       <w:r>
         <w:t>1.</w:t>
@@ -120,7 +209,7 @@
     </w:p>
     <w:p>
       <w:pPr>
-        <w:pStyle w:val="ad"/>
+        <w:pStyle w:val="a0"/>
       </w:pPr>
       <w:r>
         <w:t>1.</w:t>
@@ -137,12 +226,12 @@
     </w:p>
     <w:p>
       <w:pPr>
-        <w:pStyle w:val="ad"/>
-      </w:pPr>
-    </w:p>
-    <w:p>
-      <w:pPr>
-        <w:pStyle w:val="ad"/>
+        <w:pStyle w:val="a0"/>
+      </w:pPr>
+    </w:p>
+    <w:p>
+      <w:pPr>
+        <w:pStyle w:val="a0"/>
       </w:pPr>
       <w:r>
         <w:t>2. Критерии для предметов</w:t>
@@ -150,7 +239,7 @@
     </w:p>
     <w:p>
       <w:pPr>
-        <w:pStyle w:val="ad"/>
+        <w:pStyle w:val="a0"/>
       </w:pPr>
       <w:r>
         <w:t>2.</w:t>
@@ -167,7 +256,7 @@
     </w:p>
     <w:p>
       <w:pPr>
-        <w:pStyle w:val="ad"/>
+        <w:pStyle w:val="a0"/>
       </w:pPr>
       <w:r>
         <w:t>2.</w:t>
@@ -184,7 +273,7 @@
     </w:p>
     <w:p>
       <w:pPr>
-        <w:pStyle w:val="ad"/>
+        <w:pStyle w:val="a0"/>
       </w:pPr>
       <w:r>
         <w:t>2.3. Предмет должен иметь уровень редкости в соответствии с усилениями, которые он даёт игроку</w:t>
@@ -192,12 +281,12 @@
     </w:p>
     <w:p>
       <w:pPr>
-        <w:pStyle w:val="ad"/>
-      </w:pPr>
-    </w:p>
-    <w:p>
-      <w:pPr>
-        <w:pStyle w:val="ad"/>
+        <w:pStyle w:val="a0"/>
+      </w:pPr>
+    </w:p>
+    <w:p>
+      <w:pPr>
+        <w:pStyle w:val="a0"/>
       </w:pPr>
       <w:r>
         <w:t>3. Критерии для противников</w:t>
@@ -205,7 +294,7 @@
     </w:p>
     <w:p>
       <w:pPr>
-        <w:pStyle w:val="ad"/>
+        <w:pStyle w:val="a0"/>
       </w:pPr>
       <w:r>
         <w:t>3.</w:t>
@@ -225,7 +314,7 @@
     </w:p>
     <w:p>
       <w:pPr>
-        <w:pStyle w:val="ad"/>
+        <w:pStyle w:val="a0"/>
       </w:pPr>
       <w:r>
         <w:t>3.</w:t>
@@ -242,7 +331,7 @@
     </w:p>
     <w:p>
       <w:pPr>
-        <w:pStyle w:val="ad"/>
+        <w:pStyle w:val="a0"/>
       </w:pPr>
       <w:r>
         <w:t>3.3. Игровая система должна сама генерировать противника в соответствии с текущим бюджетом столкновения</w:t>
@@ -253,7 +342,7 @@
     </w:p>
     <w:p>
       <w:pPr>
-        <w:pStyle w:val="ad"/>
+        <w:pStyle w:val="a0"/>
       </w:pPr>
       <w:r>
         <w:t>3.4. Противники должны иметь разные уровни столкновения в соответствии с их угрозой для игрока</w:t>
@@ -264,7 +353,7 @@
     </w:p>
     <w:p>
       <w:pPr>
-        <w:pStyle w:val="ad"/>
+        <w:pStyle w:val="a0"/>
       </w:pPr>
       <w:r>
         <w:t>3.5. Противники должны иметь разные ресурсы для улучшений игрока в соответствии с их уровнем угрозы</w:t>
@@ -275,7 +364,7 @@
     </w:p>
     <w:p>
       <w:pPr>
-        <w:pStyle w:val="ad"/>
+        <w:pStyle w:val="a0"/>
       </w:pPr>
       <w:r>
         <w:t>3.6. Противники должны иметь разное количество валюты в соответствии с их уровнем угрозы</w:t>
@@ -286,26 +375,26 @@
     </w:p>
     <w:p>
       <w:pPr>
-        <w:pStyle w:val="ad"/>
-      </w:pPr>
-    </w:p>
-    <w:p>
-      <w:pPr>
-        <w:pStyle w:val="ad"/>
+        <w:pStyle w:val="a0"/>
+      </w:pPr>
+    </w:p>
+    <w:p>
+      <w:pPr>
+        <w:pStyle w:val="a0"/>
+      </w:pPr>
+      <w:r>
+        <w:t xml:space="preserve">4. </w:t>
+      </w:r>
+      <w:r>
+        <w:t>Критерии для ресурсов</w:t>
+      </w:r>
+    </w:p>
+    <w:p>
+      <w:pPr>
+        <w:pStyle w:val="a0"/>
       </w:pPr>
       <w:r>
         <w:lastRenderedPageBreak/>
-        <w:t xml:space="preserve">4. </w:t>
-      </w:r>
-      <w:r>
-        <w:t>Критерии для ресурсов</w:t>
-      </w:r>
-    </w:p>
-    <w:p>
-      <w:pPr>
-        <w:pStyle w:val="ad"/>
-      </w:pPr>
-      <w:r>
         <w:t>4.1. Ресурсы должны выпадать из противников в количестве, которое присвоит игровая система</w:t>
       </w:r>
       <w:r>
@@ -314,7 +403,7 @@
     </w:p>
     <w:p>
       <w:pPr>
-        <w:pStyle w:val="ad"/>
+        <w:pStyle w:val="a0"/>
       </w:pPr>
       <w:r>
         <w:t>4.2. Редкость ресурса должна соответствовать улучшению, которое получит игрок в процессе обмена</w:t>
@@ -325,12 +414,23 @@
     </w:p>
     <w:p>
       <w:pPr>
-        <w:pStyle w:val="ad"/>
-      </w:pPr>
-    </w:p>
-    <w:p>
-      <w:pPr>
-        <w:pStyle w:val="ad"/>
+        <w:pStyle w:val="a0"/>
+      </w:pPr>
+      <w:r>
+        <w:t>4.3. Ресурса выпадает больше если враг был повержен бесшумно</w:t>
+      </w:r>
+      <w:r>
+        <w:t>;</w:t>
+      </w:r>
+    </w:p>
+    <w:p>
+      <w:pPr>
+        <w:pStyle w:val="a0"/>
+      </w:pPr>
+    </w:p>
+    <w:p>
+      <w:pPr>
+        <w:pStyle w:val="a0"/>
       </w:pPr>
       <w:r>
         <w:t>5. Критерии для оружия</w:t>
@@ -338,7 +438,7 @@
     </w:p>
     <w:p>
       <w:pPr>
-        <w:pStyle w:val="ad"/>
+        <w:pStyle w:val="a0"/>
       </w:pPr>
       <w:r>
         <w:t>5.1. В начале забега выдаётся стартовое оружие</w:t>
@@ -349,7 +449,7 @@
     </w:p>
     <w:p>
       <w:pPr>
-        <w:pStyle w:val="ad"/>
+        <w:pStyle w:val="a0"/>
       </w:pPr>
       <w:r>
         <w:t>5.2. Оружие, с которым игрок перешел на следующий уровень, должно сохраниться игровой системой</w:t>
@@ -360,7 +460,7 @@
     </w:p>
     <w:p>
       <w:pPr>
-        <w:pStyle w:val="ad"/>
+        <w:pStyle w:val="a0"/>
       </w:pPr>
       <w:r>
         <w:t xml:space="preserve">5.3. Другое оружие можно </w:t>
@@ -377,7 +477,7 @@
     </w:p>
     <w:p>
       <w:pPr>
-        <w:pStyle w:val="ad"/>
+        <w:pStyle w:val="a0"/>
       </w:pPr>
       <w:r>
         <w:t>5.4. Смена оружия на новое означает потерю аренды на предыдущее</w:t>
@@ -388,7 +488,7 @@
     </w:p>
     <w:p>
       <w:pPr>
-        <w:pStyle w:val="ad"/>
+        <w:pStyle w:val="a0"/>
       </w:pPr>
       <w:r>
         <w:t>5.4. Оружие имеет разную ценность, которая заранее определена разработчиком</w:t>
@@ -399,7 +499,7 @@
     </w:p>
     <w:p>
       <w:pPr>
-        <w:pStyle w:val="ad"/>
+        <w:pStyle w:val="a0"/>
       </w:pPr>
       <w:r>
         <w:t>5.5.</w:t>
@@ -422,7 +522,7 @@
     </w:p>
     <w:p>
       <w:pPr>
-        <w:pStyle w:val="ad"/>
+        <w:pStyle w:val="a0"/>
       </w:pPr>
       <w:r>
         <w:t>5.6. Оружие имеет свои свойства, дерево улучшения и перки</w:t>
@@ -433,7 +533,7 @@
     </w:p>
     <w:p>
       <w:pPr>
-        <w:pStyle w:val="ad"/>
+        <w:pStyle w:val="a0"/>
       </w:pPr>
     </w:p>
     <w:p>
@@ -737,6 +837,128 @@
     </w:lvl>
   </w:abstractNum>
   <w:abstractNum w:abstractNumId="2" w15:restartNumberingAfterBreak="0">
+    <w:nsid w:val="1FDB49DC"/>
+    <w:multiLevelType w:val="multilevel"/>
+    <w:tmpl w:val="B5481914"/>
+    <w:lvl w:ilvl="0">
+      <w:start w:val="1"/>
+      <w:numFmt w:val="decimal"/>
+      <w:lvlText w:val="%1"/>
+      <w:lvlJc w:val="left"/>
+      <w:pPr>
+        <w:ind w:left="1069" w:hanging="360"/>
+      </w:pPr>
+      <w:rPr>
+        <w:rFonts w:hint="default"/>
+      </w:rPr>
+    </w:lvl>
+    <w:lvl w:ilvl="1">
+      <w:start w:val="1"/>
+      <w:numFmt w:val="decimal"/>
+      <w:isLgl/>
+      <w:suff w:val="space"/>
+      <w:lvlText w:val="%1.%2."/>
+      <w:lvlJc w:val="left"/>
+      <w:pPr>
+        <w:ind w:left="0" w:firstLine="709"/>
+      </w:pPr>
+      <w:rPr>
+        <w:rFonts w:hint="default"/>
+      </w:rPr>
+    </w:lvl>
+    <w:lvl w:ilvl="2">
+      <w:start w:val="1"/>
+      <w:numFmt w:val="decimal"/>
+      <w:isLgl/>
+      <w:lvlText w:val="%1.%2.%3."/>
+      <w:lvlJc w:val="left"/>
+      <w:pPr>
+        <w:ind w:left="1429" w:hanging="720"/>
+      </w:pPr>
+      <w:rPr>
+        <w:rFonts w:hint="default"/>
+      </w:rPr>
+    </w:lvl>
+    <w:lvl w:ilvl="3">
+      <w:start w:val="1"/>
+      <w:numFmt w:val="decimal"/>
+      <w:isLgl/>
+      <w:lvlText w:val="%1.%2.%3.%4."/>
+      <w:lvlJc w:val="left"/>
+      <w:pPr>
+        <w:ind w:left="1789" w:hanging="1080"/>
+      </w:pPr>
+      <w:rPr>
+        <w:rFonts w:hint="default"/>
+      </w:rPr>
+    </w:lvl>
+    <w:lvl w:ilvl="4">
+      <w:start w:val="1"/>
+      <w:numFmt w:val="decimal"/>
+      <w:isLgl/>
+      <w:lvlText w:val="%1.%2.%3.%4.%5."/>
+      <w:lvlJc w:val="left"/>
+      <w:pPr>
+        <w:ind w:left="1789" w:hanging="1080"/>
+      </w:pPr>
+      <w:rPr>
+        <w:rFonts w:hint="default"/>
+      </w:rPr>
+    </w:lvl>
+    <w:lvl w:ilvl="5">
+      <w:start w:val="1"/>
+      <w:numFmt w:val="decimal"/>
+      <w:isLgl/>
+      <w:lvlText w:val="%1.%2.%3.%4.%5.%6."/>
+      <w:lvlJc w:val="left"/>
+      <w:pPr>
+        <w:ind w:left="2149" w:hanging="1440"/>
+      </w:pPr>
+      <w:rPr>
+        <w:rFonts w:hint="default"/>
+      </w:rPr>
+    </w:lvl>
+    <w:lvl w:ilvl="6">
+      <w:start w:val="1"/>
+      <w:numFmt w:val="decimal"/>
+      <w:isLgl/>
+      <w:lvlText w:val="%1.%2.%3.%4.%5.%6.%7."/>
+      <w:lvlJc w:val="left"/>
+      <w:pPr>
+        <w:ind w:left="2509" w:hanging="1800"/>
+      </w:pPr>
+      <w:rPr>
+        <w:rFonts w:hint="default"/>
+      </w:rPr>
+    </w:lvl>
+    <w:lvl w:ilvl="7">
+      <w:start w:val="1"/>
+      <w:numFmt w:val="decimal"/>
+      <w:isLgl/>
+      <w:lvlText w:val="%1.%2.%3.%4.%5.%6.%7.%8."/>
+      <w:lvlJc w:val="left"/>
+      <w:pPr>
+        <w:ind w:left="2509" w:hanging="1800"/>
+      </w:pPr>
+      <w:rPr>
+        <w:rFonts w:hint="default"/>
+      </w:rPr>
+    </w:lvl>
+    <w:lvl w:ilvl="8">
+      <w:start w:val="1"/>
+      <w:numFmt w:val="decimal"/>
+      <w:isLgl/>
+      <w:lvlText w:val="%1.%2.%3.%4.%5.%6.%7.%8.%9."/>
+      <w:lvlJc w:val="left"/>
+      <w:pPr>
+        <w:ind w:left="2869" w:hanging="2160"/>
+      </w:pPr>
+      <w:rPr>
+        <w:rFonts w:hint="default"/>
+      </w:rPr>
+    </w:lvl>
+  </w:abstractNum>
+  <w:abstractNum w:abstractNumId="3" w15:restartNumberingAfterBreak="0">
     <w:nsid w:val="49201743"/>
     <w:multiLevelType w:val="multilevel"/>
     <w:tmpl w:val="502E84A4"/>
@@ -885,7 +1107,7 @@
       </w:rPr>
     </w:lvl>
   </w:abstractNum>
-  <w:abstractNum w:abstractNumId="3" w15:restartNumberingAfterBreak="0">
+  <w:abstractNum w:abstractNumId="4" w15:restartNumberingAfterBreak="0">
     <w:nsid w:val="4BD15E20"/>
     <w:multiLevelType w:val="multilevel"/>
     <w:tmpl w:val="81BC7DAC"/>
@@ -1034,7 +1256,7 @@
       </w:rPr>
     </w:lvl>
   </w:abstractNum>
-  <w:abstractNum w:abstractNumId="4" w15:restartNumberingAfterBreak="0">
+  <w:abstractNum w:abstractNumId="5" w15:restartNumberingAfterBreak="0">
     <w:nsid w:val="50D25651"/>
     <w:multiLevelType w:val="multilevel"/>
     <w:tmpl w:val="59B849D6"/>
@@ -1183,7 +1405,7 @@
       </w:rPr>
     </w:lvl>
   </w:abstractNum>
-  <w:abstractNum w:abstractNumId="5" w15:restartNumberingAfterBreak="0">
+  <w:abstractNum w:abstractNumId="6" w15:restartNumberingAfterBreak="0">
     <w:nsid w:val="5BCB51E5"/>
     <w:multiLevelType w:val="multilevel"/>
     <w:tmpl w:val="23166A54"/>
@@ -1296,7 +1518,120 @@
       </w:pPr>
     </w:lvl>
   </w:abstractNum>
-  <w:abstractNum w:abstractNumId="6" w15:restartNumberingAfterBreak="0">
+  <w:abstractNum w:abstractNumId="7" w15:restartNumberingAfterBreak="0">
+    <w:nsid w:val="795E5BAF"/>
+    <w:multiLevelType w:val="multilevel"/>
+    <w:tmpl w:val="4802D242"/>
+    <w:lvl w:ilvl="0">
+      <w:start w:val="1"/>
+      <w:numFmt w:val="decimal"/>
+      <w:lvlText w:val="%1"/>
+      <w:lvlJc w:val="left"/>
+      <w:pPr>
+        <w:ind w:left="420" w:hanging="420"/>
+      </w:pPr>
+      <w:rPr>
+        <w:rFonts w:hint="default"/>
+      </w:rPr>
+    </w:lvl>
+    <w:lvl w:ilvl="1">
+      <w:start w:val="1"/>
+      <w:numFmt w:val="decimal"/>
+      <w:lvlText w:val="%1.%2"/>
+      <w:lvlJc w:val="left"/>
+      <w:pPr>
+        <w:ind w:left="1129" w:hanging="420"/>
+      </w:pPr>
+      <w:rPr>
+        <w:rFonts w:hint="default"/>
+      </w:rPr>
+    </w:lvl>
+    <w:lvl w:ilvl="2">
+      <w:start w:val="1"/>
+      <w:numFmt w:val="decimal"/>
+      <w:lvlText w:val="%1.%2.%3"/>
+      <w:lvlJc w:val="left"/>
+      <w:pPr>
+        <w:ind w:left="2138" w:hanging="720"/>
+      </w:pPr>
+      <w:rPr>
+        <w:rFonts w:hint="default"/>
+      </w:rPr>
+    </w:lvl>
+    <w:lvl w:ilvl="3">
+      <w:start w:val="1"/>
+      <w:numFmt w:val="decimal"/>
+      <w:lvlText w:val="%1.%2.%3.%4"/>
+      <w:lvlJc w:val="left"/>
+      <w:pPr>
+        <w:ind w:left="3207" w:hanging="1080"/>
+      </w:pPr>
+      <w:rPr>
+        <w:rFonts w:hint="default"/>
+      </w:rPr>
+    </w:lvl>
+    <w:lvl w:ilvl="4">
+      <w:start w:val="1"/>
+      <w:numFmt w:val="decimal"/>
+      <w:lvlText w:val="%1.%2.%3.%4.%5"/>
+      <w:lvlJc w:val="left"/>
+      <w:pPr>
+        <w:ind w:left="3916" w:hanging="1080"/>
+      </w:pPr>
+      <w:rPr>
+        <w:rFonts w:hint="default"/>
+      </w:rPr>
+    </w:lvl>
+    <w:lvl w:ilvl="5">
+      <w:start w:val="1"/>
+      <w:numFmt w:val="decimal"/>
+      <w:lvlText w:val="%1.%2.%3.%4.%5.%6"/>
+      <w:lvlJc w:val="left"/>
+      <w:pPr>
+        <w:ind w:left="4985" w:hanging="1440"/>
+      </w:pPr>
+      <w:rPr>
+        <w:rFonts w:hint="default"/>
+      </w:rPr>
+    </w:lvl>
+    <w:lvl w:ilvl="6">
+      <w:start w:val="1"/>
+      <w:numFmt w:val="decimal"/>
+      <w:lvlText w:val="%1.%2.%3.%4.%5.%6.%7"/>
+      <w:lvlJc w:val="left"/>
+      <w:pPr>
+        <w:ind w:left="5694" w:hanging="1440"/>
+      </w:pPr>
+      <w:rPr>
+        <w:rFonts w:hint="default"/>
+      </w:rPr>
+    </w:lvl>
+    <w:lvl w:ilvl="7">
+      <w:start w:val="1"/>
+      <w:numFmt w:val="decimal"/>
+      <w:lvlText w:val="%1.%2.%3.%4.%5.%6.%7.%8"/>
+      <w:lvlJc w:val="left"/>
+      <w:pPr>
+        <w:ind w:left="6763" w:hanging="1800"/>
+      </w:pPr>
+      <w:rPr>
+        <w:rFonts w:hint="default"/>
+      </w:rPr>
+    </w:lvl>
+    <w:lvl w:ilvl="8">
+      <w:start w:val="1"/>
+      <w:numFmt w:val="decimal"/>
+      <w:lvlText w:val="%1.%2.%3.%4.%5.%6.%7.%8.%9"/>
+      <w:lvlJc w:val="left"/>
+      <w:pPr>
+        <w:ind w:left="7472" w:hanging="1800"/>
+      </w:pPr>
+      <w:rPr>
+        <w:rFonts w:hint="default"/>
+      </w:rPr>
+    </w:lvl>
+  </w:abstractNum>
+  <w:abstractNum w:abstractNumId="8" w15:restartNumberingAfterBreak="0">
     <w:nsid w:val="7D631080"/>
     <w:multiLevelType w:val="multilevel"/>
     <w:tmpl w:val="6BC046B8"/>
@@ -1449,22 +1784,28 @@
     <w:abstractNumId w:val="1"/>
   </w:num>
   <w:num w:numId="2" w16cid:durableId="40056153">
-    <w:abstractNumId w:val="2"/>
+    <w:abstractNumId w:val="3"/>
   </w:num>
   <w:num w:numId="3" w16cid:durableId="180628976">
-    <w:abstractNumId w:val="4"/>
+    <w:abstractNumId w:val="5"/>
   </w:num>
   <w:num w:numId="4" w16cid:durableId="1616983377">
-    <w:abstractNumId w:val="3"/>
+    <w:abstractNumId w:val="4"/>
   </w:num>
   <w:num w:numId="5" w16cid:durableId="270865933">
     <w:abstractNumId w:val="0"/>
   </w:num>
   <w:num w:numId="6" w16cid:durableId="939873499">
+    <w:abstractNumId w:val="8"/>
+  </w:num>
+  <w:num w:numId="7" w16cid:durableId="1534533050">
     <w:abstractNumId w:val="6"/>
   </w:num>
-  <w:num w:numId="7" w16cid:durableId="1534533050">
-    <w:abstractNumId w:val="5"/>
+  <w:num w:numId="8" w16cid:durableId="1867210845">
+    <w:abstractNumId w:val="7"/>
+  </w:num>
+  <w:num w:numId="9" w16cid:durableId="1678531472">
+    <w:abstractNumId w:val="2"/>
   </w:num>
 </w:numbering>
 </file>
@@ -1866,15 +2207,15 @@
     <w:lsdException w:name="Unresolved Mention" w:semiHidden="1" w:unhideWhenUsed="1"/>
     <w:lsdException w:name="Smart Link" w:semiHidden="1" w:unhideWhenUsed="1"/>
   </w:latentStyles>
-  <w:style w:type="paragraph" w:default="1" w:styleId="a">
+  <w:style w:type="paragraph" w:default="1" w:styleId="Normal">
     <w:name w:val="Normal"/>
     <w:qFormat/>
   </w:style>
-  <w:style w:type="paragraph" w:styleId="1">
+  <w:style w:type="paragraph" w:styleId="Heading1">
     <w:name w:val="heading 1"/>
-    <w:basedOn w:val="a"/>
-    <w:next w:val="a"/>
-    <w:link w:val="10"/>
+    <w:basedOn w:val="Normal"/>
+    <w:next w:val="Normal"/>
+    <w:link w:val="Heading1Char"/>
     <w:uiPriority w:val="9"/>
     <w:qFormat/>
     <w:rsid w:val="00340F73"/>
@@ -1893,11 +2234,11 @@
       <w:szCs w:val="40"/>
     </w:rPr>
   </w:style>
-  <w:style w:type="paragraph" w:styleId="2">
+  <w:style w:type="paragraph" w:styleId="Heading2">
     <w:name w:val="heading 2"/>
-    <w:basedOn w:val="a"/>
-    <w:next w:val="a"/>
-    <w:link w:val="20"/>
+    <w:basedOn w:val="Normal"/>
+    <w:next w:val="Normal"/>
+    <w:link w:val="Heading2Char"/>
     <w:uiPriority w:val="9"/>
     <w:unhideWhenUsed/>
     <w:qFormat/>
@@ -1916,11 +2257,11 @@
       <w:szCs w:val="32"/>
     </w:rPr>
   </w:style>
-  <w:style w:type="paragraph" w:styleId="3">
+  <w:style w:type="paragraph" w:styleId="Heading3">
     <w:name w:val="heading 3"/>
-    <w:basedOn w:val="a"/>
-    <w:next w:val="a"/>
-    <w:link w:val="30"/>
+    <w:basedOn w:val="Normal"/>
+    <w:next w:val="Normal"/>
+    <w:link w:val="Heading3Char"/>
     <w:uiPriority w:val="9"/>
     <w:semiHidden/>
     <w:unhideWhenUsed/>
@@ -1939,11 +2280,11 @@
       <w:szCs w:val="28"/>
     </w:rPr>
   </w:style>
-  <w:style w:type="paragraph" w:styleId="4">
+  <w:style w:type="paragraph" w:styleId="Heading4">
     <w:name w:val="heading 4"/>
-    <w:basedOn w:val="a"/>
-    <w:next w:val="a"/>
-    <w:link w:val="40"/>
+    <w:basedOn w:val="Normal"/>
+    <w:next w:val="Normal"/>
+    <w:link w:val="Heading4Char"/>
     <w:uiPriority w:val="9"/>
     <w:semiHidden/>
     <w:unhideWhenUsed/>
@@ -1962,11 +2303,11 @@
       <w:color w:val="0F4761" w:themeColor="accent1" w:themeShade="BF"/>
     </w:rPr>
   </w:style>
-  <w:style w:type="paragraph" w:styleId="5">
+  <w:style w:type="paragraph" w:styleId="Heading5">
     <w:name w:val="heading 5"/>
-    <w:basedOn w:val="a"/>
-    <w:next w:val="a"/>
-    <w:link w:val="50"/>
+    <w:basedOn w:val="Normal"/>
+    <w:next w:val="Normal"/>
+    <w:link w:val="Heading5Char"/>
     <w:uiPriority w:val="9"/>
     <w:semiHidden/>
     <w:unhideWhenUsed/>
@@ -1983,11 +2324,11 @@
       <w:color w:val="0F4761" w:themeColor="accent1" w:themeShade="BF"/>
     </w:rPr>
   </w:style>
-  <w:style w:type="paragraph" w:styleId="6">
+  <w:style w:type="paragraph" w:styleId="Heading6">
     <w:name w:val="heading 6"/>
-    <w:basedOn w:val="a"/>
-    <w:next w:val="a"/>
-    <w:link w:val="60"/>
+    <w:basedOn w:val="Normal"/>
+    <w:next w:val="Normal"/>
+    <w:link w:val="Heading6Char"/>
     <w:uiPriority w:val="9"/>
     <w:semiHidden/>
     <w:unhideWhenUsed/>
@@ -2006,11 +2347,11 @@
       <w:color w:val="595959" w:themeColor="text1" w:themeTint="A6"/>
     </w:rPr>
   </w:style>
-  <w:style w:type="paragraph" w:styleId="7">
+  <w:style w:type="paragraph" w:styleId="Heading7">
     <w:name w:val="heading 7"/>
-    <w:basedOn w:val="a"/>
-    <w:next w:val="a"/>
-    <w:link w:val="70"/>
+    <w:basedOn w:val="Normal"/>
+    <w:next w:val="Normal"/>
+    <w:link w:val="Heading7Char"/>
     <w:uiPriority w:val="9"/>
     <w:semiHidden/>
     <w:unhideWhenUsed/>
@@ -2027,11 +2368,11 @@
       <w:color w:val="595959" w:themeColor="text1" w:themeTint="A6"/>
     </w:rPr>
   </w:style>
-  <w:style w:type="paragraph" w:styleId="8">
+  <w:style w:type="paragraph" w:styleId="Heading8">
     <w:name w:val="heading 8"/>
-    <w:basedOn w:val="a"/>
-    <w:next w:val="a"/>
-    <w:link w:val="80"/>
+    <w:basedOn w:val="Normal"/>
+    <w:next w:val="Normal"/>
+    <w:link w:val="Heading8Char"/>
     <w:uiPriority w:val="9"/>
     <w:semiHidden/>
     <w:unhideWhenUsed/>
@@ -2050,11 +2391,11 @@
       <w:color w:val="272727" w:themeColor="text1" w:themeTint="D8"/>
     </w:rPr>
   </w:style>
-  <w:style w:type="paragraph" w:styleId="9">
+  <w:style w:type="paragraph" w:styleId="Heading9">
     <w:name w:val="heading 9"/>
-    <w:basedOn w:val="a"/>
-    <w:next w:val="a"/>
-    <w:link w:val="90"/>
+    <w:basedOn w:val="Normal"/>
+    <w:next w:val="Normal"/>
+    <w:link w:val="Heading9Char"/>
     <w:uiPriority w:val="9"/>
     <w:semiHidden/>
     <w:unhideWhenUsed/>
@@ -2071,13 +2412,12 @@
       <w:color w:val="272727" w:themeColor="text1" w:themeTint="D8"/>
     </w:rPr>
   </w:style>
-  <w:style w:type="character" w:default="1" w:styleId="a0">
+  <w:style w:type="character" w:default="1" w:styleId="DefaultParagraphFont">
     <w:name w:val="Default Paragraph Font"/>
     <w:uiPriority w:val="1"/>
-    <w:semiHidden/>
     <w:unhideWhenUsed/>
   </w:style>
-  <w:style w:type="table" w:default="1" w:styleId="a1">
+  <w:style w:type="table" w:default="1" w:styleId="TableNormal">
     <w:name w:val="Normal Table"/>
     <w:uiPriority w:val="99"/>
     <w:semiHidden/>
@@ -2092,16 +2432,16 @@
       </w:tblCellMar>
     </w:tblPr>
   </w:style>
-  <w:style w:type="numbering" w:default="1" w:styleId="a2">
+  <w:style w:type="numbering" w:default="1" w:styleId="NoList">
     <w:name w:val="No List"/>
     <w:uiPriority w:val="99"/>
     <w:semiHidden/>
     <w:unhideWhenUsed/>
   </w:style>
-  <w:style w:type="character" w:customStyle="1" w:styleId="10">
-    <w:name w:val="Заголовок 1 Знак"/>
-    <w:basedOn w:val="a0"/>
-    <w:link w:val="1"/>
+  <w:style w:type="character" w:customStyle="1" w:styleId="Heading1Char">
+    <w:name w:val="Heading 1 Char"/>
+    <w:basedOn w:val="DefaultParagraphFont"/>
+    <w:link w:val="Heading1"/>
     <w:uiPriority w:val="9"/>
     <w:rsid w:val="00340F73"/>
     <w:rPr>
@@ -2111,10 +2451,10 @@
       <w:szCs w:val="40"/>
     </w:rPr>
   </w:style>
-  <w:style w:type="character" w:customStyle="1" w:styleId="20">
-    <w:name w:val="Заголовок 2 Знак"/>
-    <w:basedOn w:val="a0"/>
-    <w:link w:val="2"/>
+  <w:style w:type="character" w:customStyle="1" w:styleId="Heading2Char">
+    <w:name w:val="Heading 2 Char"/>
+    <w:basedOn w:val="DefaultParagraphFont"/>
+    <w:link w:val="Heading2"/>
     <w:uiPriority w:val="9"/>
     <w:rsid w:val="00340F73"/>
     <w:rPr>
@@ -2123,10 +2463,10 @@
       <w:szCs w:val="32"/>
     </w:rPr>
   </w:style>
-  <w:style w:type="character" w:customStyle="1" w:styleId="30">
-    <w:name w:val="Заголовок 3 Знак"/>
-    <w:basedOn w:val="a0"/>
-    <w:link w:val="3"/>
+  <w:style w:type="character" w:customStyle="1" w:styleId="Heading3Char">
+    <w:name w:val="Heading 3 Char"/>
+    <w:basedOn w:val="DefaultParagraphFont"/>
+    <w:link w:val="Heading3"/>
     <w:uiPriority w:val="9"/>
     <w:semiHidden/>
     <w:rsid w:val="00F96EC5"/>
@@ -2137,10 +2477,10 @@
       <w:szCs w:val="28"/>
     </w:rPr>
   </w:style>
-  <w:style w:type="character" w:customStyle="1" w:styleId="40">
-    <w:name w:val="Заголовок 4 Знак"/>
-    <w:basedOn w:val="a0"/>
-    <w:link w:val="4"/>
+  <w:style w:type="character" w:customStyle="1" w:styleId="Heading4Char">
+    <w:name w:val="Heading 4 Char"/>
+    <w:basedOn w:val="DefaultParagraphFont"/>
+    <w:link w:val="Heading4"/>
     <w:uiPriority w:val="9"/>
     <w:semiHidden/>
     <w:rsid w:val="00F96EC5"/>
@@ -2151,10 +2491,10 @@
       <w:color w:val="0F4761" w:themeColor="accent1" w:themeShade="BF"/>
     </w:rPr>
   </w:style>
-  <w:style w:type="character" w:customStyle="1" w:styleId="50">
-    <w:name w:val="Заголовок 5 Знак"/>
-    <w:basedOn w:val="a0"/>
-    <w:link w:val="5"/>
+  <w:style w:type="character" w:customStyle="1" w:styleId="Heading5Char">
+    <w:name w:val="Heading 5 Char"/>
+    <w:basedOn w:val="DefaultParagraphFont"/>
+    <w:link w:val="Heading5"/>
     <w:uiPriority w:val="9"/>
     <w:semiHidden/>
     <w:rsid w:val="00F96EC5"/>
@@ -2163,10 +2503,10 @@
       <w:color w:val="0F4761" w:themeColor="accent1" w:themeShade="BF"/>
     </w:rPr>
   </w:style>
-  <w:style w:type="character" w:customStyle="1" w:styleId="60">
-    <w:name w:val="Заголовок 6 Знак"/>
-    <w:basedOn w:val="a0"/>
-    <w:link w:val="6"/>
+  <w:style w:type="character" w:customStyle="1" w:styleId="Heading6Char">
+    <w:name w:val="Heading 6 Char"/>
+    <w:basedOn w:val="DefaultParagraphFont"/>
+    <w:link w:val="Heading6"/>
     <w:uiPriority w:val="9"/>
     <w:semiHidden/>
     <w:rsid w:val="00F96EC5"/>
@@ -2177,10 +2517,10 @@
       <w:color w:val="595959" w:themeColor="text1" w:themeTint="A6"/>
     </w:rPr>
   </w:style>
-  <w:style w:type="character" w:customStyle="1" w:styleId="70">
-    <w:name w:val="Заголовок 7 Знак"/>
-    <w:basedOn w:val="a0"/>
-    <w:link w:val="7"/>
+  <w:style w:type="character" w:customStyle="1" w:styleId="Heading7Char">
+    <w:name w:val="Heading 7 Char"/>
+    <w:basedOn w:val="DefaultParagraphFont"/>
+    <w:link w:val="Heading7"/>
     <w:uiPriority w:val="9"/>
     <w:semiHidden/>
     <w:rsid w:val="00F96EC5"/>
@@ -2189,10 +2529,10 @@
       <w:color w:val="595959" w:themeColor="text1" w:themeTint="A6"/>
     </w:rPr>
   </w:style>
-  <w:style w:type="character" w:customStyle="1" w:styleId="80">
-    <w:name w:val="Заголовок 8 Знак"/>
-    <w:basedOn w:val="a0"/>
-    <w:link w:val="8"/>
+  <w:style w:type="character" w:customStyle="1" w:styleId="Heading8Char">
+    <w:name w:val="Heading 8 Char"/>
+    <w:basedOn w:val="DefaultParagraphFont"/>
+    <w:link w:val="Heading8"/>
     <w:uiPriority w:val="9"/>
     <w:semiHidden/>
     <w:rsid w:val="00F96EC5"/>
@@ -2203,10 +2543,10 @@
       <w:color w:val="272727" w:themeColor="text1" w:themeTint="D8"/>
     </w:rPr>
   </w:style>
-  <w:style w:type="character" w:customStyle="1" w:styleId="90">
-    <w:name w:val="Заголовок 9 Знак"/>
-    <w:basedOn w:val="a0"/>
-    <w:link w:val="9"/>
+  <w:style w:type="character" w:customStyle="1" w:styleId="Heading9Char">
+    <w:name w:val="Heading 9 Char"/>
+    <w:basedOn w:val="DefaultParagraphFont"/>
+    <w:link w:val="Heading9"/>
     <w:uiPriority w:val="9"/>
     <w:semiHidden/>
     <w:rsid w:val="00F96EC5"/>
@@ -2215,11 +2555,11 @@
       <w:color w:val="272727" w:themeColor="text1" w:themeTint="D8"/>
     </w:rPr>
   </w:style>
-  <w:style w:type="paragraph" w:styleId="a3">
+  <w:style w:type="paragraph" w:styleId="Title">
     <w:name w:val="Title"/>
-    <w:basedOn w:val="a"/>
-    <w:next w:val="a"/>
-    <w:link w:val="a4"/>
+    <w:basedOn w:val="Normal"/>
+    <w:next w:val="Normal"/>
+    <w:link w:val="TitleChar"/>
     <w:uiPriority w:val="10"/>
     <w:qFormat/>
     <w:rsid w:val="00F96EC5"/>
@@ -2235,10 +2575,10 @@
       <w:szCs w:val="56"/>
     </w:rPr>
   </w:style>
-  <w:style w:type="character" w:customStyle="1" w:styleId="a4">
-    <w:name w:val="Заголовок Знак"/>
-    <w:basedOn w:val="a0"/>
-    <w:link w:val="a3"/>
+  <w:style w:type="character" w:customStyle="1" w:styleId="TitleChar">
+    <w:name w:val="Title Char"/>
+    <w:basedOn w:val="DefaultParagraphFont"/>
+    <w:link w:val="Title"/>
     <w:uiPriority w:val="10"/>
     <w:rsid w:val="00F96EC5"/>
     <w:rPr>
@@ -2249,11 +2589,11 @@
       <w:szCs w:val="56"/>
     </w:rPr>
   </w:style>
-  <w:style w:type="paragraph" w:styleId="a5">
+  <w:style w:type="paragraph" w:styleId="Subtitle">
     <w:name w:val="Subtitle"/>
-    <w:basedOn w:val="a"/>
-    <w:next w:val="a"/>
-    <w:link w:val="a6"/>
+    <w:basedOn w:val="Normal"/>
+    <w:next w:val="Normal"/>
+    <w:link w:val="SubtitleChar"/>
     <w:uiPriority w:val="11"/>
     <w:qFormat/>
     <w:rsid w:val="00F96EC5"/>
@@ -2270,10 +2610,10 @@
       <w:szCs w:val="28"/>
     </w:rPr>
   </w:style>
-  <w:style w:type="character" w:customStyle="1" w:styleId="a6">
-    <w:name w:val="Подзаголовок Знак"/>
-    <w:basedOn w:val="a0"/>
-    <w:link w:val="a5"/>
+  <w:style w:type="character" w:customStyle="1" w:styleId="SubtitleChar">
+    <w:name w:val="Subtitle Char"/>
+    <w:basedOn w:val="DefaultParagraphFont"/>
+    <w:link w:val="Subtitle"/>
     <w:uiPriority w:val="11"/>
     <w:rsid w:val="00F96EC5"/>
     <w:rPr>
@@ -2284,11 +2624,11 @@
       <w:szCs w:val="28"/>
     </w:rPr>
   </w:style>
-  <w:style w:type="paragraph" w:styleId="21">
+  <w:style w:type="paragraph" w:styleId="Quote">
     <w:name w:val="Quote"/>
-    <w:basedOn w:val="a"/>
-    <w:next w:val="a"/>
-    <w:link w:val="22"/>
+    <w:basedOn w:val="Normal"/>
+    <w:next w:val="Normal"/>
+    <w:link w:val="QuoteChar"/>
     <w:uiPriority w:val="29"/>
     <w:qFormat/>
     <w:rsid w:val="00F96EC5"/>
@@ -2302,10 +2642,10 @@
       <w:color w:val="404040" w:themeColor="text1" w:themeTint="BF"/>
     </w:rPr>
   </w:style>
-  <w:style w:type="character" w:customStyle="1" w:styleId="22">
-    <w:name w:val="Цитата 2 Знак"/>
-    <w:basedOn w:val="a0"/>
-    <w:link w:val="21"/>
+  <w:style w:type="character" w:customStyle="1" w:styleId="QuoteChar">
+    <w:name w:val="Quote Char"/>
+    <w:basedOn w:val="DefaultParagraphFont"/>
+    <w:link w:val="Quote"/>
     <w:uiPriority w:val="29"/>
     <w:rsid w:val="00F96EC5"/>
     <w:rPr>
@@ -2314,9 +2654,9 @@
       <w:color w:val="404040" w:themeColor="text1" w:themeTint="BF"/>
     </w:rPr>
   </w:style>
-  <w:style w:type="paragraph" w:styleId="a7">
+  <w:style w:type="paragraph" w:styleId="ListParagraph">
     <w:name w:val="List Paragraph"/>
-    <w:basedOn w:val="a"/>
+    <w:basedOn w:val="Normal"/>
     <w:uiPriority w:val="34"/>
     <w:qFormat/>
     <w:rsid w:val="00F96EC5"/>
@@ -2325,9 +2665,9 @@
       <w:contextualSpacing/>
     </w:pPr>
   </w:style>
-  <w:style w:type="character" w:styleId="a8">
+  <w:style w:type="character" w:styleId="IntenseEmphasis">
     <w:name w:val="Intense Emphasis"/>
-    <w:basedOn w:val="a0"/>
+    <w:basedOn w:val="DefaultParagraphFont"/>
     <w:uiPriority w:val="21"/>
     <w:qFormat/>
     <w:rsid w:val="00F96EC5"/>
@@ -2337,11 +2677,11 @@
       <w:color w:val="0F4761" w:themeColor="accent1" w:themeShade="BF"/>
     </w:rPr>
   </w:style>
-  <w:style w:type="paragraph" w:styleId="a9">
+  <w:style w:type="paragraph" w:styleId="IntenseQuote">
     <w:name w:val="Intense Quote"/>
-    <w:basedOn w:val="a"/>
-    <w:next w:val="a"/>
-    <w:link w:val="aa"/>
+    <w:basedOn w:val="Normal"/>
+    <w:next w:val="Normal"/>
+    <w:link w:val="IntenseQuoteChar"/>
     <w:uiPriority w:val="30"/>
     <w:qFormat/>
     <w:rsid w:val="00F96EC5"/>
@@ -2360,10 +2700,10 @@
       <w:color w:val="0F4761" w:themeColor="accent1" w:themeShade="BF"/>
     </w:rPr>
   </w:style>
-  <w:style w:type="character" w:customStyle="1" w:styleId="aa">
-    <w:name w:val="Выделенная цитата Знак"/>
-    <w:basedOn w:val="a0"/>
-    <w:link w:val="a9"/>
+  <w:style w:type="character" w:customStyle="1" w:styleId="IntenseQuoteChar">
+    <w:name w:val="Intense Quote Char"/>
+    <w:basedOn w:val="DefaultParagraphFont"/>
+    <w:link w:val="IntenseQuote"/>
     <w:uiPriority w:val="30"/>
     <w:rsid w:val="00F96EC5"/>
     <w:rPr>
@@ -2372,9 +2712,9 @@
       <w:color w:val="0F4761" w:themeColor="accent1" w:themeShade="BF"/>
     </w:rPr>
   </w:style>
-  <w:style w:type="character" w:styleId="ab">
+  <w:style w:type="character" w:styleId="IntenseReference">
     <w:name w:val="Intense Reference"/>
-    <w:basedOn w:val="a0"/>
+    <w:basedOn w:val="DefaultParagraphFont"/>
     <w:uiPriority w:val="32"/>
     <w:qFormat/>
     <w:rsid w:val="00F96EC5"/>
@@ -2386,9 +2726,9 @@
       <w:spacing w:val="5"/>
     </w:rPr>
   </w:style>
-  <w:style w:type="paragraph" w:customStyle="1" w:styleId="ac">
+  <w:style w:type="paragraph" w:customStyle="1" w:styleId="a">
     <w:name w:val="Титул"/>
-    <w:basedOn w:val="a"/>
+    <w:basedOn w:val="Normal"/>
     <w:link w:val="Char"/>
     <w:qFormat/>
     <w:rsid w:val="00340F73"/>
@@ -2405,8 +2745,8 @@
   </w:style>
   <w:style w:type="character" w:customStyle="1" w:styleId="Char">
     <w:name w:val="Титул Char"/>
-    <w:basedOn w:val="a0"/>
-    <w:link w:val="ac"/>
+    <w:basedOn w:val="DefaultParagraphFont"/>
+    <w:link w:val="a"/>
     <w:rsid w:val="00340F73"/>
     <w:rPr>
       <w:rFonts w:ascii="Times New Roman" w:hAnsi="Times New Roman"/>
@@ -2414,9 +2754,9 @@
       <w:sz w:val="28"/>
     </w:rPr>
   </w:style>
-  <w:style w:type="paragraph" w:customStyle="1" w:styleId="ad">
+  <w:style w:type="paragraph" w:customStyle="1" w:styleId="a0">
     <w:name w:val="Стандарт"/>
-    <w:basedOn w:val="ac"/>
+    <w:basedOn w:val="a"/>
     <w:link w:val="Char0"/>
     <w:qFormat/>
     <w:rsid w:val="00340F73"/>
@@ -2428,7 +2768,7 @@
   <w:style w:type="character" w:customStyle="1" w:styleId="Char0">
     <w:name w:val="Стандарт Char"/>
     <w:basedOn w:val="Char"/>
-    <w:link w:val="ad"/>
+    <w:link w:val="a0"/>
     <w:rsid w:val="00340F73"/>
     <w:rPr>
       <w:rFonts w:ascii="Times New Roman" w:hAnsi="Times New Roman"/>
@@ -2437,9 +2777,9 @@
       <w:lang w:val="ru-RU"/>
     </w:rPr>
   </w:style>
-  <w:style w:type="character" w:styleId="ae">
+  <w:style w:type="character" w:styleId="Hyperlink">
     <w:name w:val="Hyperlink"/>
-    <w:basedOn w:val="a0"/>
+    <w:basedOn w:val="DefaultParagraphFont"/>
     <w:uiPriority w:val="99"/>
     <w:unhideWhenUsed/>
     <w:rsid w:val="00340F73"/>
@@ -2448,9 +2788,9 @@
       <w:u w:val="single"/>
     </w:rPr>
   </w:style>
-  <w:style w:type="character" w:styleId="af">
+  <w:style w:type="character" w:styleId="UnresolvedMention">
     <w:name w:val="Unresolved Mention"/>
-    <w:basedOn w:val="a0"/>
+    <w:basedOn w:val="DefaultParagraphFont"/>
     <w:uiPriority w:val="99"/>
     <w:semiHidden/>
     <w:unhideWhenUsed/>
@@ -2460,9 +2800,9 @@
       <w:shd w:val="clear" w:color="auto" w:fill="E1DFDD"/>
     </w:rPr>
   </w:style>
-  <w:style w:type="table" w:styleId="af0">
+  <w:style w:type="table" w:styleId="TableGrid">
     <w:name w:val="Table Grid"/>
-    <w:basedOn w:val="a1"/>
+    <w:basedOn w:val="TableNormal"/>
     <w:uiPriority w:val="39"/>
     <w:rsid w:val="00D8032E"/>
     <w:pPr>

</xml_diff>